<commit_message>
docs: enlarge diagram + Word body fonts for legibility
- Diagrams: substantially larger fonts (readable when embedded at ~6.4in) with
  consolidated, sparser layouts; fixed clipped labels (Fig 2 spoke header, Fig 5
  caption) and removed the caption-crossing connectors in Fig 3. Regenerated PNGs.
- Word doc: body 10.5 -> 12pt, headings/tables/code/captions scaled to match;
  regenerated .docx and the 28-page .pdf (TOC updated).

README figures reference the same filenames, so the clearer PNGs render automatically.
Docs-only; no code change.

Co-Authored-By: Claude Opus 4.8 <noreply@anthropic.com>
</commit_message>
<xml_diff>
--- a/docs/OverWatch_System_Design_and_Architecture.docx
+++ b/docs/OverWatch_System_Design_and_Architecture.docx
@@ -132,7 +132,7 @@
               <w:rPr>
                 <w:b/>
                 <w:color w:val="FFFFFF"/>
-                <w:sz w:val="19"/>
+                <w:sz w:val="21"/>
               </w:rPr>
               <w:t>Field</w:t>
             </w:r>
@@ -152,7 +152,7 @@
               <w:rPr>
                 <w:b/>
                 <w:color w:val="FFFFFF"/>
-                <w:sz w:val="19"/>
+                <w:sz w:val="21"/>
               </w:rPr>
               <w:t>Value</w:t>
             </w:r>
@@ -168,7 +168,7 @@
             <w:r/>
             <w:r>
               <w:rPr>
-                <w:sz w:val="18"/>
+                <w:sz w:val="21"/>
               </w:rPr>
               <w:t>Title</w:t>
             </w:r>
@@ -182,7 +182,7 @@
             <w:r/>
             <w:r>
               <w:rPr>
-                <w:sz w:val="18"/>
+                <w:sz w:val="21"/>
               </w:rPr>
               <w:t>OverWatch — System Design, Architecture &amp; Implementation Guide</w:t>
             </w:r>
@@ -198,7 +198,7 @@
             <w:r/>
             <w:r>
               <w:rPr>
-                <w:sz w:val="18"/>
+                <w:sz w:val="21"/>
               </w:rPr>
               <w:t>Product</w:t>
             </w:r>
@@ -212,7 +212,7 @@
             <w:r/>
             <w:r>
               <w:rPr>
-                <w:sz w:val="18"/>
+                <w:sz w:val="21"/>
               </w:rPr>
               <w:t>OverWatch CNAPP (repo: AWS-Security-Scanner)</w:t>
             </w:r>
@@ -228,7 +228,7 @@
             <w:r/>
             <w:r>
               <w:rPr>
-                <w:sz w:val="18"/>
+                <w:sz w:val="21"/>
               </w:rPr>
               <w:t>Platform version</w:t>
             </w:r>
@@ -242,7 +242,7 @@
             <w:r/>
             <w:r>
               <w:rPr>
-                <w:sz w:val="18"/>
+                <w:sz w:val="21"/>
               </w:rPr>
               <w:t>v2.35.0 (aws_live_scanner.VERSION)</w:t>
             </w:r>
@@ -258,7 +258,7 @@
             <w:r/>
             <w:r>
               <w:rPr>
-                <w:sz w:val="18"/>
+                <w:sz w:val="21"/>
               </w:rPr>
               <w:t>Test posture</w:t>
             </w:r>
@@ -272,7 +272,7 @@
             <w:r/>
             <w:r>
               <w:rPr>
-                <w:sz w:val="18"/>
+                <w:sz w:val="21"/>
               </w:rPr>
               <w:t>2169 backend tests (mock boto3, no credentials) · 181 frontend vitest</w:t>
             </w:r>
@@ -288,7 +288,7 @@
             <w:r/>
             <w:r>
               <w:rPr>
-                <w:sz w:val="18"/>
+                <w:sz w:val="21"/>
               </w:rPr>
               <w:t>Audience</w:t>
             </w:r>
@@ -302,7 +302,7 @@
             <w:r/>
             <w:r>
               <w:rPr>
-                <w:sz w:val="18"/>
+                <w:sz w:val="21"/>
               </w:rPr>
               <w:t>Platform / security engineers, architects, operators</w:t>
             </w:r>
@@ -318,7 +318,7 @@
             <w:r/>
             <w:r>
               <w:rPr>
-                <w:sz w:val="18"/>
+                <w:sz w:val="21"/>
               </w:rPr>
               <w:t>Prepared with</w:t>
             </w:r>
@@ -332,7 +332,7 @@
             <w:r/>
             <w:r>
               <w:rPr>
-                <w:sz w:val="18"/>
+                <w:sz w:val="21"/>
               </w:rPr>
               <w:t>Grounded in the repository source at time of writing</w:t>
             </w:r>
@@ -501,7 +501,7 @@
               <w:rPr>
                 <w:b/>
                 <w:color w:val="FFFFFF"/>
-                <w:sz w:val="19"/>
+                <w:sz w:val="21"/>
               </w:rPr>
               <w:t>OverWatch IS</w:t>
             </w:r>
@@ -521,7 +521,7 @@
               <w:rPr>
                 <w:b/>
                 <w:color w:val="FFFFFF"/>
-                <w:sz w:val="19"/>
+                <w:sz w:val="21"/>
               </w:rPr>
               <w:t>OverWatch is NOT</w:t>
             </w:r>
@@ -537,7 +537,7 @@
             <w:r/>
             <w:r>
               <w:rPr>
-                <w:sz w:val="18"/>
+                <w:sz w:val="21"/>
               </w:rPr>
               <w:t>Agentless — audits via AWS APIs only</w:t>
             </w:r>
@@ -551,7 +551,7 @@
             <w:r/>
             <w:r>
               <w:rPr>
-                <w:sz w:val="18"/>
+                <w:sz w:val="21"/>
               </w:rPr>
               <w:t>An agent / eBPF runtime sensor</w:t>
             </w:r>
@@ -567,7 +567,7 @@
             <w:r/>
             <w:r>
               <w:rPr>
-                <w:sz w:val="18"/>
+                <w:sz w:val="21"/>
               </w:rPr>
               <w:t>Read-only — never mutates a scanned resource</w:t>
             </w:r>
@@ -581,7 +581,7 @@
             <w:r/>
             <w:r>
               <w:rPr>
-                <w:sz w:val="18"/>
+                <w:sz w:val="21"/>
               </w:rPr>
               <w:t>A remediation actuator that changes cloud state</w:t>
             </w:r>
@@ -597,7 +597,7 @@
             <w:r/>
             <w:r>
               <w:rPr>
-                <w:sz w:val="18"/>
+                <w:sz w:val="21"/>
               </w:rPr>
               <w:t>Self-hosted — runs inside the customer boundary</w:t>
             </w:r>
@@ -611,7 +611,7 @@
             <w:r/>
             <w:r>
               <w:rPr>
-                <w:sz w:val="18"/>
+                <w:sz w:val="21"/>
               </w:rPr>
               <w:t>A multi-tenant SaaS that ingests customer data</w:t>
             </w:r>
@@ -627,7 +627,7 @@
             <w:r/>
             <w:r>
               <w:rPr>
-                <w:sz w:val="18"/>
+                <w:sz w:val="21"/>
               </w:rPr>
               <w:t>AWS-first CNAPP with an attack-path graph</w:t>
             </w:r>
@@ -641,7 +641,7 @@
             <w:r/>
             <w:r>
               <w:rPr>
-                <w:sz w:val="18"/>
+                <w:sz w:val="21"/>
               </w:rPr>
               <w:t>A flat compliance checklist scanner</w:t>
             </w:r>
@@ -657,7 +657,7 @@
             <w:r/>
             <w:r>
               <w:rPr>
-                <w:sz w:val="18"/>
+                <w:sz w:val="21"/>
               </w:rPr>
               <w:t>Zero-telemetry / air-gap installable</w:t>
             </w:r>
@@ -671,7 +671,7 @@
             <w:r/>
             <w:r>
               <w:rPr>
-                <w:sz w:val="18"/>
+                <w:sz w:val="21"/>
               </w:rPr>
               <w:t>A phone-home / cloud-callback product</w:t>
             </w:r>
@@ -687,7 +687,7 @@
             <w:r/>
             <w:r>
               <w:rPr>
-                <w:sz w:val="18"/>
+                <w:sz w:val="21"/>
               </w:rPr>
               <w:t>A platform that ingests existing runtime signals</w:t>
             </w:r>
@@ -701,7 +701,7 @@
             <w:r/>
             <w:r>
               <w:rPr>
-                <w:sz w:val="18"/>
+                <w:sz w:val="21"/>
               </w:rPr>
               <w:t>A DAST / active-exploitation tool</w:t>
             </w:r>
@@ -859,7 +859,7 @@
               <w:rPr>
                 <w:b/>
                 <w:color w:val="FFFFFF"/>
-                <w:sz w:val="19"/>
+                <w:sz w:val="21"/>
               </w:rPr>
               <w:t>Pillar</w:t>
             </w:r>
@@ -879,7 +879,7 @@
               <w:rPr>
                 <w:b/>
                 <w:color w:val="FFFFFF"/>
-                <w:sz w:val="19"/>
+                <w:sz w:val="21"/>
               </w:rPr>
               <w:t>Meaning</w:t>
             </w:r>
@@ -899,7 +899,7 @@
               <w:rPr>
                 <w:b/>
                 <w:color w:val="FFFFFF"/>
-                <w:sz w:val="19"/>
+                <w:sz w:val="21"/>
               </w:rPr>
               <w:t>Why it is load-bearing</w:t>
             </w:r>
@@ -915,7 +915,7 @@
             <w:r/>
             <w:r>
               <w:rPr>
-                <w:sz w:val="18"/>
+                <w:sz w:val="21"/>
               </w:rPr>
               <w:t>Agentless</w:t>
             </w:r>
@@ -929,7 +929,7 @@
             <w:r/>
             <w:r>
               <w:rPr>
-                <w:sz w:val="18"/>
+                <w:sz w:val="21"/>
               </w:rPr>
               <w:t>Audit via AWS control-plane APIs only; no agent, no eBPF, no data-plane read</w:t>
             </w:r>
@@ -943,7 +943,7 @@
             <w:r/>
             <w:r>
               <w:rPr>
-                <w:sz w:val="18"/>
+                <w:sz w:val="21"/>
               </w:rPr>
               <w:t>Preserves the sovereign wedge and keeps the blast radius of OverWatch itself near zero</w:t>
             </w:r>
@@ -959,7 +959,7 @@
             <w:r/>
             <w:r>
               <w:rPr>
-                <w:sz w:val="18"/>
+                <w:sz w:val="21"/>
               </w:rPr>
               <w:t>Read-only</w:t>
             </w:r>
@@ -973,7 +973,7 @@
             <w:r/>
             <w:r>
               <w:rPr>
-                <w:sz w:val="18"/>
+                <w:sz w:val="21"/>
               </w:rPr>
               <w:t>Never mutate a scanned resource; no active exploitation / DAST</w:t>
             </w:r>
@@ -987,7 +987,7 @@
             <w:r/>
             <w:r>
               <w:rPr>
-                <w:sz w:val="18"/>
+                <w:sz w:val="21"/>
               </w:rPr>
               <w:t>A security tool must never be the cause of an incident in the estate it audits</w:t>
             </w:r>
@@ -1003,7 +1003,7 @@
             <w:r/>
             <w:r>
               <w:rPr>
-                <w:sz w:val="18"/>
+                <w:sz w:val="21"/>
               </w:rPr>
               <w:t>Self-hosted</w:t>
             </w:r>
@@ -1017,7 +1017,7 @@
             <w:r/>
             <w:r>
               <w:rPr>
-                <w:sz w:val="18"/>
+                <w:sz w:val="21"/>
               </w:rPr>
               <w:t>Runs entirely inside the customer boundary</w:t>
             </w:r>
@@ -1031,7 +1031,7 @@
             <w:r/>
             <w:r>
               <w:rPr>
-                <w:sz w:val="18"/>
+                <w:sz w:val="21"/>
               </w:rPr>
               <w:t>No customer data leaves the boundary; suits regulated / air-gapped orgs</w:t>
             </w:r>
@@ -1047,7 +1047,7 @@
             <w:r/>
             <w:r>
               <w:rPr>
-                <w:sz w:val="18"/>
+                <w:sz w:val="21"/>
               </w:rPr>
               <w:t>AWS-first</w:t>
             </w:r>
@@ -1061,7 +1061,7 @@
             <w:r/>
             <w:r>
               <w:rPr>
-                <w:sz w:val="18"/>
+                <w:sz w:val="21"/>
               </w:rPr>
               <w:t>AWS is the primary, deeply-modeled cloud</w:t>
             </w:r>
@@ -1075,7 +1075,7 @@
             <w:r/>
             <w:r>
               <w:rPr>
-                <w:sz w:val="18"/>
+                <w:sz w:val="21"/>
               </w:rPr>
               <w:t>Depth over breadth — the attack-path graph is AWS-native</w:t>
             </w:r>
@@ -1130,7 +1130,7 @@
               <w:rPr>
                 <w:b/>
                 <w:color w:val="FFFFFF"/>
-                <w:sz w:val="19"/>
+                <w:sz w:val="21"/>
               </w:rPr>
               <w:t>Allowlisted egress file</w:t>
             </w:r>
@@ -1150,7 +1150,7 @@
               <w:rPr>
                 <w:b/>
                 <w:color w:val="FFFFFF"/>
-                <w:sz w:val="19"/>
+                <w:sz w:val="21"/>
               </w:rPr>
               <w:t>Sole purpose</w:t>
             </w:r>
@@ -1166,7 +1166,7 @@
             <w:r/>
             <w:r>
               <w:rPr>
-                <w:sz w:val="18"/>
+                <w:sz w:val="21"/>
               </w:rPr>
               <w:t>aws_kube.py</w:t>
             </w:r>
@@ -1180,7 +1180,7 @@
             <w:r/>
             <w:r>
               <w:rPr>
-                <w:sz w:val="18"/>
+                <w:sz w:val="21"/>
               </w:rPr>
               <w:t>Read-only Kubernetes API reads for KSPM/KIEM (operator-configured seam)</w:t>
             </w:r>
@@ -1196,7 +1196,7 @@
             <w:r/>
             <w:r>
               <w:rPr>
-                <w:sz w:val="18"/>
+                <w:sz w:val="21"/>
               </w:rPr>
               <w:t>cnapp_connectors.py</w:t>
             </w:r>
@@ -1210,7 +1210,7 @@
             <w:r/>
             <w:r>
               <w:rPr>
-                <w:sz w:val="18"/>
+                <w:sz w:val="21"/>
               </w:rPr>
               <w:t>Outbound notifications to the operator's OWN tools (Jira/Slack/…)</w:t>
             </w:r>
@@ -1226,7 +1226,7 @@
             <w:r/>
             <w:r>
               <w:rPr>
-                <w:sz w:val="18"/>
+                <w:sz w:val="21"/>
               </w:rPr>
               <w:t>aws_layer_fetch.py</w:t>
             </w:r>
@@ -1240,7 +1240,7 @@
             <w:r/>
             <w:r>
               <w:rPr>
-                <w:sz w:val="18"/>
+                <w:sz w:val="21"/>
               </w:rPr>
               <w:t>Registry layer-blob pulls — ECR presigned S3 + non-AWS OCI registries</w:t>
             </w:r>
@@ -1409,7 +1409,7 @@
       <w:r>
         <w:drawing>
           <wp:inline xmlns:a="http://schemas.openxmlformats.org/drawingml/2006/main" xmlns:pic="http://schemas.openxmlformats.org/drawingml/2006/picture">
-            <wp:extent cx="5852160" cy="3850105"/>
+            <wp:extent cx="5852160" cy="5131242"/>
             <wp:docPr id="1" name="Picture 1"/>
             <wp:cNvGraphicFramePr>
               <a:graphicFrameLocks noChangeAspect="1"/>
@@ -1430,7 +1430,7 @@
                   <pic:spPr>
                     <a:xfrm>
                       <a:off x="0" y="0"/>
-                      <a:ext cx="5852160" cy="3850105"/>
+                      <a:ext cx="5852160" cy="5131242"/>
                     </a:xfrm>
                     <a:prstGeom prst="rect"/>
                   </pic:spPr>
@@ -1450,7 +1450,7 @@
         <w:rPr>
           <w:i/>
           <w:color w:val="5B6672"/>
-          <w:sz w:val="18"/>
+          <w:sz w:val="20"/>
         </w:rPr>
         <w:t>Figure 1 — Logical architecture: a React console over a fail-closed control plane over a pure scanning engine, which reaches AWS (and optional seams) read-only.</w:t>
       </w:r>
@@ -1479,7 +1479,7 @@
       <w:r>
         <w:drawing>
           <wp:inline xmlns:a="http://schemas.openxmlformats.org/drawingml/2006/main" xmlns:pic="http://schemas.openxmlformats.org/drawingml/2006/picture">
-            <wp:extent cx="5852160" cy="3563815"/>
+            <wp:extent cx="5852160" cy="3928162"/>
             <wp:docPr id="2" name="Picture 2"/>
             <wp:cNvGraphicFramePr>
               <a:graphicFrameLocks noChangeAspect="1"/>
@@ -1500,7 +1500,7 @@
                   <pic:spPr>
                     <a:xfrm>
                       <a:off x="0" y="0"/>
-                      <a:ext cx="5852160" cy="3563815"/>
+                      <a:ext cx="5852160" cy="3928162"/>
                     </a:xfrm>
                     <a:prstGeom prst="rect"/>
                   </pic:spPr>
@@ -1520,7 +1520,7 @@
         <w:rPr>
           <w:i/>
           <w:color w:val="5B6672"/>
-          <w:sz w:val="18"/>
+          <w:sz w:val="20"/>
         </w:rPr>
         <w:t>Figure 2 — Runtime topology: one hardened container on a private subnet reaches AWS via VPC endpoints and assumes read-only roles into each spoke account; no public-internet egress.</w:t>
       </w:r>
@@ -1559,7 +1559,7 @@
               <w:rPr>
                 <w:b/>
                 <w:color w:val="FFFFFF"/>
-                <w:sz w:val="19"/>
+                <w:sz w:val="21"/>
               </w:rPr>
               <w:t>Layer</w:t>
             </w:r>
@@ -1579,7 +1579,7 @@
               <w:rPr>
                 <w:b/>
                 <w:color w:val="FFFFFF"/>
-                <w:sz w:val="19"/>
+                <w:sz w:val="21"/>
               </w:rPr>
               <w:t>Technology</w:t>
             </w:r>
@@ -1595,7 +1595,7 @@
             <w:r/>
             <w:r>
               <w:rPr>
-                <w:sz w:val="18"/>
+                <w:sz w:val="21"/>
               </w:rPr>
               <w:t>Engine language</w:t>
             </w:r>
@@ -1609,7 +1609,7 @@
             <w:r/>
             <w:r>
               <w:rPr>
-                <w:sz w:val="18"/>
+                <w:sz w:val="21"/>
               </w:rPr>
               <w:t>Python 3.10+ (container: python:3.12-slim)</w:t>
             </w:r>
@@ -1625,7 +1625,7 @@
             <w:r/>
             <w:r>
               <w:rPr>
-                <w:sz w:val="18"/>
+                <w:sz w:val="21"/>
               </w:rPr>
               <w:t>AWS access</w:t>
             </w:r>
@@ -1639,7 +1639,7 @@
             <w:r/>
             <w:r>
               <w:rPr>
-                <w:sz w:val="18"/>
+                <w:sz w:val="21"/>
               </w:rPr>
               <w:t>boto3 / botocore (read-only)</w:t>
             </w:r>
@@ -1655,7 +1655,7 @@
             <w:r/>
             <w:r>
               <w:rPr>
-                <w:sz w:val="18"/>
+                <w:sz w:val="21"/>
               </w:rPr>
               <w:t>API framework</w:t>
             </w:r>
@@ -1669,7 +1669,7 @@
             <w:r/>
             <w:r>
               <w:rPr>
-                <w:sz w:val="18"/>
+                <w:sz w:val="21"/>
               </w:rPr>
               <w:t>FastAPI + Starlette on uvicorn (pure-Python h11 build)</w:t>
             </w:r>
@@ -1685,7 +1685,7 @@
             <w:r/>
             <w:r>
               <w:rPr>
-                <w:sz w:val="18"/>
+                <w:sz w:val="21"/>
               </w:rPr>
               <w:t>Data validation</w:t>
             </w:r>
@@ -1699,7 +1699,7 @@
             <w:r/>
             <w:r>
               <w:rPr>
-                <w:sz w:val="18"/>
+                <w:sz w:val="21"/>
               </w:rPr>
               <w:t>pydantic v2</w:t>
             </w:r>
@@ -1715,7 +1715,7 @@
             <w:r/>
             <w:r>
               <w:rPr>
-                <w:sz w:val="18"/>
+                <w:sz w:val="21"/>
               </w:rPr>
               <w:t>State store</w:t>
             </w:r>
@@ -1729,7 +1729,7 @@
             <w:r/>
             <w:r>
               <w:rPr>
-                <w:sz w:val="18"/>
+                <w:sz w:val="21"/>
               </w:rPr>
               <w:t>SQLite (stdlib) or PostgreSQL via psycopg3 — one Backend abstraction</w:t>
             </w:r>
@@ -1745,7 +1745,7 @@
             <w:r/>
             <w:r>
               <w:rPr>
-                <w:sz w:val="18"/>
+                <w:sz w:val="21"/>
               </w:rPr>
               <w:t>Web console</w:t>
             </w:r>
@@ -1759,7 +1759,7 @@
             <w:r/>
             <w:r>
               <w:rPr>
-                <w:sz w:val="18"/>
+                <w:sz w:val="21"/>
               </w:rPr>
               <w:t>React single-page application (Vite build, static assets)</w:t>
             </w:r>
@@ -1775,7 +1775,7 @@
             <w:r/>
             <w:r>
               <w:rPr>
-                <w:sz w:val="18"/>
+                <w:sz w:val="21"/>
               </w:rPr>
               <w:t>Packaging</w:t>
             </w:r>
@@ -1789,7 +1789,7 @@
             <w:r/>
             <w:r>
               <w:rPr>
-                <w:sz w:val="18"/>
+                <w:sz w:val="21"/>
               </w:rPr>
               <w:t>Multi-stage, non-root Docker image; offline wheelhouse; --no-index build</w:t>
             </w:r>
@@ -1918,7 +1918,7 @@
       <w:r>
         <w:drawing>
           <wp:inline xmlns:a="http://schemas.openxmlformats.org/drawingml/2006/main" xmlns:pic="http://schemas.openxmlformats.org/drawingml/2006/picture">
-            <wp:extent cx="5852160" cy="2100775"/>
+            <wp:extent cx="5852160" cy="2885997"/>
             <wp:docPr id="3" name="Picture 3"/>
             <wp:cNvGraphicFramePr>
               <a:graphicFrameLocks noChangeAspect="1"/>
@@ -1939,7 +1939,7 @@
                   <pic:spPr>
                     <a:xfrm>
                       <a:off x="0" y="0"/>
-                      <a:ext cx="5852160" cy="2100775"/>
+                      <a:ext cx="5852160" cy="2885997"/>
                     </a:xfrm>
                     <a:prstGeom prst="rect"/>
                   </pic:spPr>
@@ -1959,7 +1959,7 @@
         <w:rPr>
           <w:i/>
           <w:color w:val="5B6672"/>
-          <w:sz w:val="18"/>
+          <w:sz w:val="20"/>
         </w:rPr>
         <w:t>Figure 3 — The scan pipeline and engine fan-out: read-only stages build the graph; the specialized posture engines all read from it (annotations enrich; only E_PATH edges are traversed).</w:t>
       </w:r>
@@ -2006,7 +2006,7 @@
               <w:rPr>
                 <w:b/>
                 <w:color w:val="FFFFFF"/>
-                <w:sz w:val="19"/>
+                <w:sz w:val="21"/>
               </w:rPr>
               <w:t>Category</w:t>
             </w:r>
@@ -2026,7 +2026,7 @@
               <w:rPr>
                 <w:b/>
                 <w:color w:val="FFFFFF"/>
-                <w:sz w:val="19"/>
+                <w:sz w:val="21"/>
               </w:rPr>
               <w:t>Representative node kinds</w:t>
             </w:r>
@@ -2042,7 +2042,7 @@
             <w:r/>
             <w:r>
               <w:rPr>
-                <w:sz w:val="18"/>
+                <w:sz w:val="21"/>
               </w:rPr>
               <w:t>Identity</w:t>
             </w:r>
@@ -2056,7 +2056,7 @@
             <w:r/>
             <w:r>
               <w:rPr>
-                <w:sz w:val="18"/>
+                <w:sz w:val="21"/>
               </w:rPr>
               <w:t>IAMRole, InstanceProfile, ServicePrincipal, FederatedPrincipal, AnyPrincipal, AdminCapability</w:t>
             </w:r>
@@ -2072,7 +2072,7 @@
             <w:r/>
             <w:r>
               <w:rPr>
-                <w:sz w:val="18"/>
+                <w:sz w:val="21"/>
               </w:rPr>
               <w:t>Compute / workload</w:t>
             </w:r>
@@ -2086,7 +2086,7 @@
             <w:r/>
             <w:r>
               <w:rPr>
-                <w:sz w:val="18"/>
+                <w:sz w:val="21"/>
               </w:rPr>
               <w:t>LambdaFunction, ECSFargateTask, ECSTaskDefinition, NetworkInterface</w:t>
             </w:r>
@@ -2102,7 +2102,7 @@
             <w:r/>
             <w:r>
               <w:rPr>
-                <w:sz w:val="18"/>
+                <w:sz w:val="21"/>
               </w:rPr>
               <w:t>Network front</w:t>
             </w:r>
@@ -2116,7 +2116,7 @@
             <w:r/>
             <w:r>
               <w:rPr>
-                <w:sz w:val="18"/>
+                <w:sz w:val="21"/>
               </w:rPr>
               <w:t>LoadBalancer, CloudFrontDistribution, ApiGateway, InternetSource, ObservedCidr, DanglingDNSRecord</w:t>
             </w:r>
@@ -2132,7 +2132,7 @@
             <w:r/>
             <w:r>
               <w:rPr>
-                <w:sz w:val="18"/>
+                <w:sz w:val="21"/>
               </w:rPr>
               <w:t>Data &amp; secrets</w:t>
             </w:r>
@@ -2146,7 +2146,7 @@
             <w:r/>
             <w:r>
               <w:rPr>
-                <w:sz w:val="18"/>
+                <w:sz w:val="21"/>
               </w:rPr>
               <w:t>S3 / DataStore kinds, Secret, SecretsManagerSecret, KMSKey</w:t>
             </w:r>
@@ -2162,7 +2162,7 @@
             <w:r/>
             <w:r>
               <w:rPr>
-                <w:sz w:val="18"/>
+                <w:sz w:val="21"/>
               </w:rPr>
               <w:t>Containers / K8s</w:t>
             </w:r>
@@ -2176,7 +2176,7 @@
             <w:r/>
             <w:r>
               <w:rPr>
-                <w:sz w:val="18"/>
+                <w:sz w:val="21"/>
               </w:rPr>
               <w:t>ECRRepository, ECRImage, KubePod, KubeServiceAccount, KubeAdminCapability</w:t>
             </w:r>
@@ -2192,7 +2192,7 @@
             <w:r/>
             <w:r>
               <w:rPr>
-                <w:sz w:val="18"/>
+                <w:sz w:val="21"/>
               </w:rPr>
               <w:t>Risk overlays</w:t>
             </w:r>
@@ -2206,7 +2206,7 @@
             <w:r/>
             <w:r>
               <w:rPr>
-                <w:sz w:val="18"/>
+                <w:sz w:val="21"/>
               </w:rPr>
               <w:t>Vulnerability / cve, ThreatFinding, CdrDetection</w:t>
             </w:r>
@@ -2255,7 +2255,7 @@
       <w:r>
         <w:drawing>
           <wp:inline xmlns:a="http://schemas.openxmlformats.org/drawingml/2006/main" xmlns:pic="http://schemas.openxmlformats.org/drawingml/2006/picture">
-            <wp:extent cx="5852160" cy="2888566"/>
+            <wp:extent cx="5852160" cy="3157086"/>
             <wp:docPr id="4" name="Picture 4"/>
             <wp:cNvGraphicFramePr>
               <a:graphicFrameLocks noChangeAspect="1"/>
@@ -2276,7 +2276,7 @@
                   <pic:spPr>
                     <a:xfrm>
                       <a:off x="0" y="0"/>
-                      <a:ext cx="5852160" cy="2888566"/>
+                      <a:ext cx="5852160" cy="3157086"/>
                     </a:xfrm>
                     <a:prstGeom prst="rect"/>
                   </pic:spPr>
@@ -2296,7 +2296,7 @@
         <w:rPr>
           <w:i/>
           <w:color w:val="5B6672"/>
-          <w:sz w:val="18"/>
+          <w:sz w:val="20"/>
         </w:rPr>
         <w:t>Figure 4 — An end-to-end attack path over traversable (solid) edges; annotations (dashed) enrich nodes. The score is gated-multiplicative, so a missing factor collapses the path — see §4.5.</w:t>
       </w:r>
@@ -2787,7 +2787,7 @@
         <w:rPr>
           <w:rFonts w:ascii="Consolas" w:hAnsi="Consolas"/>
           <w:color w:val="1F2A37"/>
-          <w:sz w:val="17"/>
+          <w:sz w:val="19"/>
         </w:rPr>
         <w:t>// "crown-jewel S3 buckets reachable from the internet" — the toxic-combination query</w:t>
       </w:r>
@@ -2798,7 +2798,7 @@
         <w:rPr>
           <w:rFonts w:ascii="Consolas" w:hAnsi="Consolas"/>
           <w:color w:val="1F2A37"/>
-          <w:sz w:val="17"/>
+          <w:sz w:val="19"/>
         </w:rPr>
         <w:t>{ "kind": "S3Bucket",</w:t>
       </w:r>
@@ -2809,7 +2809,7 @@
         <w:rPr>
           <w:rFonts w:ascii="Consolas" w:hAnsi="Consolas"/>
           <w:color w:val="1F2A37"/>
-          <w:sz w:val="17"/>
+          <w:sz w:val="19"/>
         </w:rPr>
         <w:t xml:space="preserve">  "where": { "op": "and", "of": [</w:t>
       </w:r>
@@ -2820,7 +2820,7 @@
         <w:rPr>
           <w:rFonts w:ascii="Consolas" w:hAnsi="Consolas"/>
           <w:color w:val="1F2A37"/>
-          <w:sz w:val="17"/>
+          <w:sz w:val="19"/>
         </w:rPr>
         <w:t xml:space="preserve">      { "pred": "crown_jewel" },</w:t>
       </w:r>
@@ -2831,7 +2831,7 @@
         <w:rPr>
           <w:rFonts w:ascii="Consolas" w:hAnsi="Consolas"/>
           <w:color w:val="1F2A37"/>
-          <w:sz w:val="17"/>
+          <w:sz w:val="19"/>
         </w:rPr>
         <w:t xml:space="preserve">      { "pred": "reachable_from", "target": "internet" } ] } }</w:t>
       </w:r>
@@ -3086,7 +3086,7 @@
               <w:rPr>
                 <w:b/>
                 <w:color w:val="FFFFFF"/>
-                <w:sz w:val="19"/>
+                <w:sz w:val="21"/>
               </w:rPr>
               <w:t>Domain</w:t>
             </w:r>
@@ -3106,7 +3106,7 @@
               <w:rPr>
                 <w:b/>
                 <w:color w:val="FFFFFF"/>
-                <w:sz w:val="19"/>
+                <w:sz w:val="21"/>
               </w:rPr>
               <w:t>Representative routes</w:t>
             </w:r>
@@ -3122,7 +3122,7 @@
             <w:r/>
             <w:r>
               <w:rPr>
-                <w:sz w:val="18"/>
+                <w:sz w:val="21"/>
               </w:rPr>
               <w:t>Accounts &amp; scans</w:t>
             </w:r>
@@ -3136,7 +3136,7 @@
             <w:r/>
             <w:r>
               <w:rPr>
-                <w:sz w:val="18"/>
+                <w:sz w:val="21"/>
               </w:rPr>
               <w:t>POST /accounts, POST /accounts/{id}/validate, POST /scans, GET /scans/{job}</w:t>
             </w:r>
@@ -3152,7 +3152,7 @@
             <w:r/>
             <w:r>
               <w:rPr>
-                <w:sz w:val="18"/>
+                <w:sz w:val="21"/>
               </w:rPr>
               <w:t>Findings &amp; graph</w:t>
             </w:r>
@@ -3166,7 +3166,7 @@
             <w:r/>
             <w:r>
               <w:rPr>
-                <w:sz w:val="18"/>
+                <w:sz w:val="21"/>
               </w:rPr>
               <w:t>GET /accounts/{id}/{summary,findings,paths,graph}, GET /org/{overview,findings}</w:t>
             </w:r>
@@ -3182,7 +3182,7 @@
             <w:r/>
             <w:r>
               <w:rPr>
-                <w:sz w:val="18"/>
+                <w:sz w:val="21"/>
               </w:rPr>
               <w:t>Graph query</w:t>
             </w:r>
@@ -3196,7 +3196,7 @@
             <w:r/>
             <w:r>
               <w:rPr>
-                <w:sz w:val="18"/>
+                <w:sz w:val="21"/>
               </w:rPr>
               <w:t>POST /accounts/{id}/graph/query (WQL), GET /controls, GET /policies</w:t>
             </w:r>
@@ -3212,7 +3212,7 @@
             <w:r/>
             <w:r>
               <w:rPr>
-                <w:sz w:val="18"/>
+                <w:sz w:val="21"/>
               </w:rPr>
               <w:t>Ingest</w:t>
             </w:r>
@@ -3226,7 +3226,7 @@
             <w:r/>
             <w:r>
               <w:rPr>
-                <w:sz w:val="18"/>
+                <w:sz w:val="21"/>
               </w:rPr>
               <w:t>POST /accounts/{id}/ingest, .../detections, .../edr/ingest, .../malware/ingest</w:t>
             </w:r>
@@ -3242,7 +3242,7 @@
             <w:r/>
             <w:r>
               <w:rPr>
-                <w:sz w:val="18"/>
+                <w:sz w:val="21"/>
               </w:rPr>
               <w:t>Data &amp; runtime</w:t>
             </w:r>
@@ -3256,7 +3256,7 @@
             <w:r/>
             <w:r>
               <w:rPr>
-                <w:sz w:val="18"/>
+                <w:sz w:val="21"/>
               </w:rPr>
               <w:t>GET /accounts/{id}/data/inventory, .../edr/coverage, GET /org/incidents</w:t>
             </w:r>
@@ -3272,7 +3272,7 @@
             <w:r/>
             <w:r>
               <w:rPr>
-                <w:sz w:val="18"/>
+                <w:sz w:val="21"/>
               </w:rPr>
               <w:t>Supply chain</w:t>
             </w:r>
@@ -3286,7 +3286,7 @@
             <w:r/>
             <w:r>
               <w:rPr>
-                <w:sz w:val="18"/>
+                <w:sz w:val="21"/>
               </w:rPr>
               <w:t>GET /accounts/{id}/sbom/{subjects,snapshots,diff}, .../components, .../vex</w:t>
             </w:r>
@@ -3302,7 +3302,7 @@
             <w:r/>
             <w:r>
               <w:rPr>
-                <w:sz w:val="18"/>
+                <w:sz w:val="21"/>
               </w:rPr>
               <w:t>Non-AWS registries</w:t>
             </w:r>
@@ -3316,7 +3316,7 @@
             <w:r/>
             <w:r>
               <w:rPr>
-                <w:sz w:val="18"/>
+                <w:sz w:val="21"/>
               </w:rPr>
               <w:t>GET /registries, GET /registries/images, POST /registries/{id}/scan</w:t>
             </w:r>
@@ -3332,7 +3332,7 @@
             <w:r/>
             <w:r>
               <w:rPr>
-                <w:sz w:val="18"/>
+                <w:sz w:val="21"/>
               </w:rPr>
               <w:t>Multi-tenancy</w:t>
             </w:r>
@@ -3346,7 +3346,7 @@
             <w:r/>
             <w:r>
               <w:rPr>
-                <w:sz w:val="18"/>
+                <w:sz w:val="21"/>
               </w:rPr>
               <w:t>POST/GET /workspaces, /admin/platform-admins, /admin/usage</w:t>
             </w:r>
@@ -3427,7 +3427,7 @@
       <w:r>
         <w:drawing>
           <wp:inline xmlns:a="http://schemas.openxmlformats.org/drawingml/2006/main" xmlns:pic="http://schemas.openxmlformats.org/drawingml/2006/picture">
-            <wp:extent cx="5852160" cy="2772076"/>
+            <wp:extent cx="5852160" cy="3046330"/>
             <wp:docPr id="5" name="Picture 5"/>
             <wp:cNvGraphicFramePr>
               <a:graphicFrameLocks noChangeAspect="1"/>
@@ -3448,7 +3448,7 @@
                   <pic:spPr>
                     <a:xfrm>
                       <a:off x="0" y="0"/>
-                      <a:ext cx="5852160" cy="2772076"/>
+                      <a:ext cx="5852160" cy="3046330"/>
                     </a:xfrm>
                     <a:prstGeom prst="rect"/>
                   </pic:spPr>
@@ -3468,7 +3468,7 @@
         <w:rPr>
           <w:i/>
           <w:color w:val="5B6672"/>
-          <w:sz w:val="18"/>
+          <w:sz w:val="20"/>
         </w:rPr>
         <w:t>Figure 5 — Egress containment: the bulk of egress is read-only boto3 to the customer's own accounts; only three allowlisted files may open any other socket; internet / telemetry is blocked.</w:t>
       </w:r>
@@ -3596,7 +3596,7 @@
               <w:rPr>
                 <w:b/>
                 <w:color w:val="FFFFFF"/>
-                <w:sz w:val="19"/>
+                <w:sz w:val="21"/>
               </w:rPr>
               <w:t>Step</w:t>
             </w:r>
@@ -3616,7 +3616,7 @@
               <w:rPr>
                 <w:b/>
                 <w:color w:val="FFFFFF"/>
-                <w:sz w:val="19"/>
+                <w:sz w:val="21"/>
               </w:rPr>
               <w:t>Artifact</w:t>
             </w:r>
@@ -3636,7 +3636,7 @@
               <w:rPr>
                 <w:b/>
                 <w:color w:val="FFFFFF"/>
-                <w:sz w:val="19"/>
+                <w:sz w:val="21"/>
               </w:rPr>
               <w:t>Purpose</w:t>
             </w:r>
@@ -3652,7 +3652,7 @@
             <w:r/>
             <w:r>
               <w:rPr>
-                <w:sz w:val="18"/>
+                <w:sz w:val="21"/>
               </w:rPr>
               <w:t>1</w:t>
             </w:r>
@@ -3666,7 +3666,7 @@
             <w:r/>
             <w:r>
               <w:rPr>
-                <w:sz w:val="18"/>
+                <w:sz w:val="21"/>
               </w:rPr>
               <w:t>deploy/cnapp-hub-role.yaml</w:t>
             </w:r>
@@ -3680,7 +3680,7 @@
             <w:r/>
             <w:r>
               <w:rPr>
-                <w:sz w:val="18"/>
+                <w:sz w:val="21"/>
               </w:rPr>
               <w:t>Create CnappHubRole + CnappHubInstanceProfile (the hub identity)</w:t>
             </w:r>
@@ -3696,7 +3696,7 @@
             <w:r/>
             <w:r>
               <w:rPr>
-                <w:sz w:val="18"/>
+                <w:sz w:val="21"/>
               </w:rPr>
               <w:t>2</w:t>
             </w:r>
@@ -3710,7 +3710,7 @@
             <w:r/>
             <w:r>
               <w:rPr>
-                <w:sz w:val="18"/>
+                <w:sz w:val="21"/>
               </w:rPr>
               <w:t>deploy/marketplace/hub-deploy.yaml</w:t>
             </w:r>
@@ -3724,7 +3724,7 @@
             <w:r/>
             <w:r>
               <w:rPr>
-                <w:sz w:val="18"/>
+                <w:sz w:val="21"/>
               </w:rPr>
               <w:t>Launch the hub EC2 instance (private subnet, KMS volume, SG, container)</w:t>
             </w:r>
@@ -3740,7 +3740,7 @@
             <w:r/>
             <w:r>
               <w:rPr>
-                <w:sz w:val="18"/>
+                <w:sz w:val="21"/>
               </w:rPr>
               <w:t>3</w:t>
             </w:r>
@@ -3754,7 +3754,7 @@
             <w:r/>
             <w:r>
               <w:rPr>
-                <w:sz w:val="18"/>
+                <w:sz w:val="21"/>
               </w:rPr>
               <w:t>deploy/cnapp-scanner-role.yaml</w:t>
             </w:r>
@@ -3768,7 +3768,7 @@
             <w:r/>
             <w:r>
               <w:rPr>
-                <w:sz w:val="18"/>
+                <w:sz w:val="21"/>
               </w:rPr>
               <w:t>Deploy the read-only role into each spoke account (or via StackSet)</w:t>
             </w:r>
@@ -3815,7 +3815,7 @@
               <w:rPr>
                 <w:b/>
                 <w:color w:val="FFFFFF"/>
-                <w:sz w:val="19"/>
+                <w:sz w:val="21"/>
               </w:rPr>
               <w:t>Variable</w:t>
             </w:r>
@@ -3835,7 +3835,7 @@
               <w:rPr>
                 <w:b/>
                 <w:color w:val="FFFFFF"/>
-                <w:sz w:val="19"/>
+                <w:sz w:val="21"/>
               </w:rPr>
               <w:t>Purpose</w:t>
             </w:r>
@@ -3851,7 +3851,7 @@
             <w:r/>
             <w:r>
               <w:rPr>
-                <w:sz w:val="18"/>
+                <w:sz w:val="21"/>
               </w:rPr>
               <w:t>CNAPP_DB_URL</w:t>
             </w:r>
@@ -3865,7 +3865,7 @@
             <w:r/>
             <w:r>
               <w:rPr>
-                <w:sz w:val="18"/>
+                <w:sz w:val="21"/>
               </w:rPr>
               <w:t>State backend: sqlite:////data/overwatch.db (default) or postgresql://…</w:t>
             </w:r>
@@ -3881,7 +3881,7 @@
             <w:r/>
             <w:r>
               <w:rPr>
-                <w:sz w:val="18"/>
+                <w:sz w:val="21"/>
               </w:rPr>
               <w:t>CNAPP_HUB_ROLE_ARN</w:t>
             </w:r>
@@ -3895,7 +3895,7 @@
             <w:r/>
             <w:r>
               <w:rPr>
-                <w:sz w:val="18"/>
+                <w:sz w:val="21"/>
               </w:rPr>
               <w:t>The hub role the instance assumes-from into spokes</w:t>
             </w:r>
@@ -3911,7 +3911,7 @@
             <w:r/>
             <w:r>
               <w:rPr>
-                <w:sz w:val="18"/>
+                <w:sz w:val="21"/>
               </w:rPr>
               <w:t>CNAPP_STATIC_DIR</w:t>
             </w:r>
@@ -3925,7 +3925,7 @@
             <w:r/>
             <w:r>
               <w:rPr>
-                <w:sz w:val="18"/>
+                <w:sz w:val="21"/>
               </w:rPr>
               <w:t>Path to the prebuilt SPA served by the hub</w:t>
             </w:r>
@@ -3941,7 +3941,7 @@
             <w:r/>
             <w:r>
               <w:rPr>
-                <w:sz w:val="18"/>
+                <w:sz w:val="21"/>
               </w:rPr>
               <w:t>CNAPP_VULN_DB</w:t>
             </w:r>
@@ -3955,7 +3955,7 @@
             <w:r/>
             <w:r>
               <w:rPr>
-                <w:sz w:val="18"/>
+                <w:sz w:val="21"/>
               </w:rPr>
               <w:t>Path to the (optionally signed) BYO OSV/EPSS/KEV feed</w:t>
             </w:r>
@@ -3971,7 +3971,7 @@
             <w:r/>
             <w:r>
               <w:rPr>
-                <w:sz w:val="18"/>
+                <w:sz w:val="21"/>
               </w:rPr>
               <w:t>CNAPP_PROJECTS / _CONTROLS / _POLICIES / _REGISTRIES</w:t>
             </w:r>
@@ -3985,7 +3985,7 @@
             <w:r/>
             <w:r>
               <w:rPr>
-                <w:sz w:val="18"/>
+                <w:sz w:val="21"/>
               </w:rPr>
               <w:t>Config-driven overlays (JSON list or file path; fail-safe)</w:t>
             </w:r>
@@ -4001,7 +4001,7 @@
             <w:r/>
             <w:r>
               <w:rPr>
-                <w:sz w:val="18"/>
+                <w:sz w:val="21"/>
               </w:rPr>
               <w:t>OVERWATCH_AIRGAP</w:t>
             </w:r>
@@ -4015,7 +4015,7 @@
             <w:r/>
             <w:r>
               <w:rPr>
-                <w:sz w:val="18"/>
+                <w:sz w:val="21"/>
               </w:rPr>
               <w:t>Documents the sealed posture (all optional seams already default off)</w:t>
             </w:r>
@@ -4306,7 +4306,7 @@
               <w:rPr>
                 <w:b/>
                 <w:color w:val="FFFFFF"/>
-                <w:sz w:val="19"/>
+                <w:sz w:val="21"/>
               </w:rPr>
               <w:t>Guard</w:t>
             </w:r>
@@ -4326,7 +4326,7 @@
               <w:rPr>
                 <w:b/>
                 <w:color w:val="FFFFFF"/>
-                <w:sz w:val="19"/>
+                <w:sz w:val="21"/>
               </w:rPr>
               <w:t>What it enforces</w:t>
             </w:r>
@@ -4342,7 +4342,7 @@
             <w:r/>
             <w:r>
               <w:rPr>
-                <w:sz w:val="18"/>
+                <w:sz w:val="21"/>
               </w:rPr>
               <w:t>tests/test_zero_telemetry.py</w:t>
             </w:r>
@@ -4356,7 +4356,7 @@
             <w:r/>
             <w:r>
               <w:rPr>
-                <w:sz w:val="18"/>
+                <w:sz w:val="21"/>
               </w:rPr>
               <w:t>Recursive-AST tripwire: only the 3 allowlisted files hold a network primitive</w:t>
             </w:r>
@@ -4372,7 +4372,7 @@
             <w:r/>
             <w:r>
               <w:rPr>
-                <w:sz w:val="18"/>
+                <w:sz w:val="21"/>
               </w:rPr>
               <w:t>Correlator checksum test</w:t>
             </w:r>
@@ -4386,7 +4386,7 @@
             <w:r/>
             <w:r>
               <w:rPr>
-                <w:sz w:val="18"/>
+                <w:sz w:val="21"/>
               </w:rPr>
               <w:t>aws_correlate is byte-frozen (traversable-edge set + crown logic)</w:t>
             </w:r>
@@ -4402,7 +4402,7 @@
             <w:r/>
             <w:r>
               <w:rPr>
-                <w:sz w:val="18"/>
+                <w:sz w:val="21"/>
               </w:rPr>
               <w:t>Cross-language parity fixture</w:t>
             </w:r>
@@ -4416,7 +4416,7 @@
             <w:r/>
             <w:r>
               <w:rPr>
-                <w:sz w:val="18"/>
+                <w:sz w:val="21"/>
               </w:rPr>
               <w:t>Python oracle == TypeScript client mirror (WQL/Controls/DSPM/Policy)</w:t>
             </w:r>
@@ -4432,7 +4432,7 @@
             <w:r/>
             <w:r>
               <w:rPr>
-                <w:sz w:val="18"/>
+                <w:sz w:val="21"/>
               </w:rPr>
               <w:t>Fail-closed / partial-data tests</w:t>
             </w:r>
@@ -4446,7 +4446,7 @@
             <w:r/>
             <w:r>
               <w:rPr>
-                <w:sz w:val="18"/>
+                <w:sz w:val="21"/>
               </w:rPr>
               <w:t>Partial rootfs, truncated layer, unsigned feed all fail closed</w:t>
             </w:r>
@@ -4530,7 +4530,7 @@
               <w:rPr>
                 <w:b/>
                 <w:color w:val="FFFFFF"/>
-                <w:sz w:val="19"/>
+                <w:sz w:val="21"/>
               </w:rPr>
               <w:t>Module</w:t>
             </w:r>
@@ -4550,7 +4550,7 @@
               <w:rPr>
                 <w:b/>
                 <w:color w:val="FFFFFF"/>
-                <w:sz w:val="19"/>
+                <w:sz w:val="21"/>
               </w:rPr>
               <w:t>Responsibility</w:t>
             </w:r>
@@ -4566,7 +4566,7 @@
             <w:r/>
             <w:r>
               <w:rPr>
-                <w:sz w:val="18"/>
+                <w:sz w:val="21"/>
               </w:rPr>
               <w:t>aws_live_scanner.py</w:t>
             </w:r>
@@ -4580,7 +4580,7 @@
             <w:r/>
             <w:r>
               <w:rPr>
-                <w:sz w:val="18"/>
+                <w:sz w:val="21"/>
               </w:rPr>
               <w:t>Live audit scanner entrypoint (296 checks / 44 sections; orchestrates the engine)</w:t>
             </w:r>
@@ -4596,7 +4596,7 @@
             <w:r/>
             <w:r>
               <w:rPr>
-                <w:sz w:val="18"/>
+                <w:sz w:val="21"/>
               </w:rPr>
               <w:t>aws_graph.py</w:t>
             </w:r>
@@ -4610,7 +4610,7 @@
             <w:r/>
             <w:r>
               <w:rPr>
-                <w:sz w:val="18"/>
+                <w:sz w:val="21"/>
               </w:rPr>
               <w:t>The security graph (typed nodes + edges)</w:t>
             </w:r>
@@ -4626,7 +4626,7 @@
             <w:r/>
             <w:r>
               <w:rPr>
-                <w:sz w:val="18"/>
+                <w:sz w:val="21"/>
               </w:rPr>
               <w:t>aws_exposure.py</w:t>
             </w:r>
@@ -4640,7 +4640,7 @@
             <w:r/>
             <w:r>
               <w:rPr>
-                <w:sz w:val="18"/>
+                <w:sz w:val="21"/>
               </w:rPr>
               <w:t>Internet exposure + L7 four-gate reachability oracle</w:t>
             </w:r>
@@ -4656,7 +4656,7 @@
             <w:r/>
             <w:r>
               <w:rPr>
-                <w:sz w:val="18"/>
+                <w:sz w:val="21"/>
               </w:rPr>
               <w:t>aws_deepplane.py</w:t>
             </w:r>
@@ -4670,7 +4670,7 @@
             <w:r/>
             <w:r>
               <w:rPr>
-                <w:sz w:val="18"/>
+                <w:sz w:val="21"/>
               </w:rPr>
               <w:t>Deep-plane ingestion (Inspector/Macie/GuardDuty/Access Analyzer) + DSPM read surface</w:t>
             </w:r>
@@ -4686,7 +4686,7 @@
             <w:r/>
             <w:r>
               <w:rPr>
-                <w:sz w:val="18"/>
+                <w:sz w:val="21"/>
               </w:rPr>
               <w:t>aws_correlate.py</w:t>
             </w:r>
@@ -4700,7 +4700,7 @@
             <w:r/>
             <w:r>
               <w:rPr>
-                <w:sz w:val="18"/>
+                <w:sz w:val="21"/>
               </w:rPr>
               <w:t>Attack-path correlation &amp; choke points (byte-frozen)</w:t>
             </w:r>
@@ -4716,7 +4716,7 @@
             <w:r/>
             <w:r>
               <w:rPr>
-                <w:sz w:val="18"/>
+                <w:sz w:val="21"/>
               </w:rPr>
               <w:t>aws_effperm.py</w:t>
             </w:r>
@@ -4730,7 +4730,7 @@
             <w:r/>
             <w:r>
               <w:rPr>
-                <w:sz w:val="18"/>
+                <w:sz w:val="21"/>
               </w:rPr>
               <w:t>Effective-permissions solver (identity ∩ boundary ∩ SCP)</w:t>
             </w:r>
@@ -4746,7 +4746,7 @@
             <w:r/>
             <w:r>
               <w:rPr>
-                <w:sz w:val="18"/>
+                <w:sz w:val="21"/>
               </w:rPr>
               <w:t>aws_leastpriv.py</w:t>
             </w:r>
@@ -4760,7 +4760,7 @@
             <w:r/>
             <w:r>
               <w:rPr>
-                <w:sz w:val="18"/>
+                <w:sz w:val="21"/>
               </w:rPr>
               <w:t>CIEM right-sizing + least-privilege policy generation</w:t>
             </w:r>
@@ -4776,7 +4776,7 @@
             <w:r/>
             <w:r>
               <w:rPr>
-                <w:sz w:val="18"/>
+                <w:sz w:val="21"/>
               </w:rPr>
               <w:t>aws_sidescan*.py</w:t>
             </w:r>
@@ -4790,7 +4790,7 @@
             <w:r/>
             <w:r>
               <w:rPr>
-                <w:sz w:val="18"/>
+                <w:sz w:val="21"/>
               </w:rPr>
               <w:t>Agentless CWPP: inventory + OSV match + secrets + image layer overlay</w:t>
             </w:r>
@@ -4806,7 +4806,7 @@
             <w:r/>
             <w:r>
               <w:rPr>
-                <w:sz w:val="18"/>
+                <w:sz w:val="21"/>
               </w:rPr>
               <w:t>aws_kube.py</w:t>
             </w:r>
@@ -4820,7 +4820,7 @@
             <w:r/>
             <w:r>
               <w:rPr>
-                <w:sz w:val="18"/>
+                <w:sz w:val="21"/>
               </w:rPr>
               <w:t>KSPM/KIEM over a read-only Kubernetes API seam (egress-allowlisted)</w:t>
             </w:r>
@@ -4836,7 +4836,7 @@
             <w:r/>
             <w:r>
               <w:rPr>
-                <w:sz w:val="18"/>
+                <w:sz w:val="21"/>
               </w:rPr>
               <w:t>aws_dspm.py / aws_secrets.py</w:t>
             </w:r>
@@ -4850,7 +4850,7 @@
             <w:r/>
             <w:r>
               <w:rPr>
-                <w:sz w:val="18"/>
+                <w:sz w:val="21"/>
               </w:rPr>
               <w:t>Data security posture + AWS-resident secrets (metadata only)</w:t>
             </w:r>
@@ -4866,7 +4866,7 @@
             <w:r/>
             <w:r>
               <w:rPr>
-                <w:sz w:val="18"/>
+                <w:sz w:val="21"/>
               </w:rPr>
               <w:t>aws_aispm.py</w:t>
             </w:r>
@@ -4880,7 +4880,7 @@
             <w:r/>
             <w:r>
               <w:rPr>
-                <w:sz w:val="18"/>
+                <w:sz w:val="21"/>
               </w:rPr>
               <w:t>AI security posture (execution-role blast radius)</w:t>
             </w:r>
@@ -4896,7 +4896,7 @@
             <w:r/>
             <w:r>
               <w:rPr>
-                <w:sz w:val="18"/>
+                <w:sz w:val="21"/>
               </w:rPr>
               <w:t>aws_cdr.py / aws_edr.py / aws_malware.py</w:t>
             </w:r>
@@ -4910,7 +4910,7 @@
             <w:r/>
             <w:r>
               <w:rPr>
-                <w:sz w:val="18"/>
+                <w:sz w:val="21"/>
               </w:rPr>
               <w:t>Runtime / EDR / malware ingest (THREAT_ON, out of E_PATH)</w:t>
             </w:r>
@@ -4926,7 +4926,7 @@
             <w:r/>
             <w:r>
               <w:rPr>
-                <w:sz w:val="18"/>
+                <w:sz w:val="21"/>
               </w:rPr>
               <w:t>aws_forensics.py</w:t>
             </w:r>
@@ -4940,7 +4940,7 @@
             <w:r/>
             <w:r>
               <w:rPr>
-                <w:sz w:val="18"/>
+                <w:sz w:val="21"/>
               </w:rPr>
               <w:t>CloudTrail-based cloud-forensics timeline</w:t>
             </w:r>
@@ -4956,7 +4956,7 @@
             <w:r/>
             <w:r>
               <w:rPr>
-                <w:sz w:val="18"/>
+                <w:sz w:val="21"/>
               </w:rPr>
               <w:t>aws_copilot.py</w:t>
             </w:r>
@@ -4970,7 +4970,7 @@
             <w:r/>
             <w:r>
               <w:rPr>
-                <w:sz w:val="18"/>
+                <w:sz w:val="21"/>
               </w:rPr>
               <w:t>Grounded-RAG copilot over the scan's own corpus</w:t>
             </w:r>
@@ -4986,7 +4986,7 @@
             <w:r/>
             <w:r>
               <w:rPr>
-                <w:sz w:val="18"/>
+                <w:sz w:val="21"/>
               </w:rPr>
               <w:t>aws_ingest.py / aws_sbom_diff.py / aws_license.py / aws_vex.py</w:t>
             </w:r>
@@ -5000,7 +5000,7 @@
             <w:r/>
             <w:r>
               <w:rPr>
-                <w:sz w:val="18"/>
+                <w:sz w:val="21"/>
               </w:rPr>
               <w:t>External-vuln &amp; supply-chain ingest, diff, license, VEX</w:t>
             </w:r>
@@ -5016,7 +5016,7 @@
             <w:r/>
             <w:r>
               <w:rPr>
-                <w:sz w:val="18"/>
+                <w:sz w:val="21"/>
               </w:rPr>
               <w:t>aws_wql.py / aws_controls.py / aws_policy.py</w:t>
             </w:r>
@@ -5030,7 +5030,7 @@
             <w:r/>
             <w:r>
               <w:rPr>
-                <w:sz w:val="18"/>
+                <w:sz w:val="21"/>
               </w:rPr>
               <w:t>Graph query language + Controls + policy-as-code</w:t>
             </w:r>
@@ -5046,7 +5046,7 @@
             <w:r/>
             <w:r>
               <w:rPr>
-                <w:sz w:val="18"/>
+                <w:sz w:val="21"/>
               </w:rPr>
               <w:t>aws_registry_sbom.py / aws_sidescan_image.py</w:t>
             </w:r>
@@ -5060,7 +5060,7 @@
             <w:r/>
             <w:r>
               <w:rPr>
-                <w:sz w:val="18"/>
+                <w:sz w:val="21"/>
               </w:rPr>
               <w:t>ECR registry side-scan; shared registry-agnostic scan path</w:t>
             </w:r>
@@ -5076,7 +5076,7 @@
             <w:r/>
             <w:r>
               <w:rPr>
-                <w:sz w:val="18"/>
+                <w:sz w:val="21"/>
               </w:rPr>
               <w:t>aws_registry_oci.py / aws_registry_connectors.py</w:t>
             </w:r>
@@ -5090,7 +5090,7 @@
             <w:r/>
             <w:r>
               <w:rPr>
-                <w:sz w:val="18"/>
+                <w:sz w:val="21"/>
               </w:rPr>
               <w:t>Non-AWS OCI registry pull adapter + connector config</w:t>
             </w:r>
@@ -5106,7 +5106,7 @@
             <w:r/>
             <w:r>
               <w:rPr>
-                <w:sz w:val="18"/>
+                <w:sz w:val="21"/>
               </w:rPr>
               <w:t>aws_layer_fetch.py</w:t>
             </w:r>
@@ -5120,7 +5120,7 @@
             <w:r/>
             <w:r>
               <w:rPr>
-                <w:sz w:val="18"/>
+                <w:sz w:val="21"/>
               </w:rPr>
               <w:t>The sole registry layer-blob egress seam (ECR + OCI), allowlisted</w:t>
             </w:r>
@@ -5136,7 +5136,7 @@
             <w:r/>
             <w:r>
               <w:rPr>
-                <w:sz w:val="18"/>
+                <w:sz w:val="21"/>
               </w:rPr>
               <w:t>aws_state.py / cnapp_backend.py</w:t>
             </w:r>
@@ -5150,7 +5150,7 @@
             <w:r/>
             <w:r>
               <w:rPr>
-                <w:sz w:val="18"/>
+                <w:sz w:val="21"/>
               </w:rPr>
               <w:t>Finding lifecycle/drift/waivers + dual-dialect backend</w:t>
             </w:r>
@@ -5166,7 +5166,7 @@
             <w:r/>
             <w:r>
               <w:rPr>
-                <w:sz w:val="18"/>
+                <w:sz w:val="21"/>
               </w:rPr>
               <w:t>cnapp_service.py / cnapp_api.py</w:t>
             </w:r>
@@ -5180,7 +5180,7 @@
             <w:r/>
             <w:r>
               <w:rPr>
-                <w:sz w:val="18"/>
+                <w:sz w:val="21"/>
               </w:rPr>
               <w:t>PlatformService facade + FastAPI routes (fail-closed RBAC)</w:t>
             </w:r>
@@ -5196,7 +5196,7 @@
             <w:r/>
             <w:r>
               <w:rPr>
-                <w:sz w:val="18"/>
+                <w:sz w:val="21"/>
               </w:rPr>
               <w:t>cnapp_onboarding / _validate / _registry / _worker</w:t>
             </w:r>
@@ -5210,7 +5210,7 @@
             <w:r/>
             <w:r>
               <w:rPr>
-                <w:sz w:val="18"/>
+                <w:sz w:val="21"/>
               </w:rPr>
               <w:t>Onboarding, trust validation, account registry, scan workers</w:t>
             </w:r>
@@ -5226,7 +5226,7 @@
             <w:r/>
             <w:r>
               <w:rPr>
-                <w:sz w:val="18"/>
+                <w:sz w:val="21"/>
               </w:rPr>
               <w:t>cnapp_workspace.py / cnapp_metering.py</w:t>
             </w:r>
@@ -5240,7 +5240,7 @@
             <w:r/>
             <w:r>
               <w:rPr>
-                <w:sz w:val="18"/>
+                <w:sz w:val="21"/>
               </w:rPr>
               <w:t>Multi-tenancy (workspaces) + usage metering</w:t>
             </w:r>
@@ -5256,7 +5256,7 @@
             <w:r/>
             <w:r>
               <w:rPr>
-                <w:sz w:val="18"/>
+                <w:sz w:val="21"/>
               </w:rPr>
               <w:t>cnapp_connectors.py</w:t>
             </w:r>
@@ -5270,7 +5270,7 @@
             <w:r/>
             <w:r>
               <w:rPr>
-                <w:sz w:val="18"/>
+                <w:sz w:val="21"/>
               </w:rPr>
               <w:t>Outbound notification connectors (allowlisted egress)</w:t>
             </w:r>
@@ -5309,7 +5309,7 @@
         <w:rPr>
           <w:rFonts w:ascii="Consolas" w:hAnsi="Consolas"/>
           <w:color w:val="1F2A37"/>
-          <w:sz w:val="17"/>
+          <w:sz w:val="19"/>
         </w:rPr>
         <w:t>EXPOSED_TO · ATTACHED_TO · HAS_INSTANCE_PROFILE · HAS_ROLE · CAN_ASSUME · CAN_PRIVESC_TO · CAN_READ_DATA · TARGETS</w:t>
       </w:r>
@@ -5332,7 +5332,7 @@
         <w:rPr>
           <w:rFonts w:ascii="Consolas" w:hAnsi="Consolas"/>
           <w:color w:val="1F2A37"/>
-          <w:sz w:val="17"/>
+          <w:sz w:val="19"/>
         </w:rPr>
         <w:t>HAS_VULN · THREAT_ON · RUNS_IMAGE · HAS_TECH  (and other non-traversable relationships)</w:t>
       </w:r>
@@ -5379,7 +5379,7 @@
               <w:rPr>
                 <w:b/>
                 <w:color w:val="FFFFFF"/>
-                <w:sz w:val="19"/>
+                <w:sz w:val="21"/>
               </w:rPr>
               <w:t>Method &amp; path</w:t>
             </w:r>
@@ -5399,7 +5399,7 @@
               <w:rPr>
                 <w:b/>
                 <w:color w:val="FFFFFF"/>
-                <w:sz w:val="19"/>
+                <w:sz w:val="21"/>
               </w:rPr>
               <w:t>Role</w:t>
             </w:r>
@@ -5415,7 +5415,7 @@
             <w:r/>
             <w:r>
               <w:rPr>
-                <w:sz w:val="18"/>
+                <w:sz w:val="21"/>
               </w:rPr>
               <w:t>POST /accounts</w:t>
             </w:r>
@@ -5429,7 +5429,7 @@
             <w:r/>
             <w:r>
               <w:rPr>
-                <w:sz w:val="18"/>
+                <w:sz w:val="21"/>
               </w:rPr>
               <w:t>admin</w:t>
             </w:r>
@@ -5445,7 +5445,7 @@
             <w:r/>
             <w:r>
               <w:rPr>
-                <w:sz w:val="18"/>
+                <w:sz w:val="21"/>
               </w:rPr>
               <w:t>POST /accounts/{id}/validate</w:t>
             </w:r>
@@ -5459,7 +5459,7 @@
             <w:r/>
             <w:r>
               <w:rPr>
-                <w:sz w:val="18"/>
+                <w:sz w:val="21"/>
               </w:rPr>
               <w:t>admin</w:t>
             </w:r>
@@ -5475,7 +5475,7 @@
             <w:r/>
             <w:r>
               <w:rPr>
-                <w:sz w:val="18"/>
+                <w:sz w:val="21"/>
               </w:rPr>
               <w:t>POST /scans</w:t>
             </w:r>
@@ -5489,7 +5489,7 @@
             <w:r/>
             <w:r>
               <w:rPr>
-                <w:sz w:val="18"/>
+                <w:sz w:val="21"/>
               </w:rPr>
               <w:t>admin</w:t>
             </w:r>
@@ -5505,7 +5505,7 @@
             <w:r/>
             <w:r>
               <w:rPr>
-                <w:sz w:val="18"/>
+                <w:sz w:val="21"/>
               </w:rPr>
               <w:t>GET /scans/{job_id}</w:t>
             </w:r>
@@ -5519,7 +5519,7 @@
             <w:r/>
             <w:r>
               <w:rPr>
-                <w:sz w:val="18"/>
+                <w:sz w:val="21"/>
               </w:rPr>
               <w:t>viewer</w:t>
             </w:r>
@@ -5535,7 +5535,7 @@
             <w:r/>
             <w:r>
               <w:rPr>
-                <w:sz w:val="18"/>
+                <w:sz w:val="21"/>
               </w:rPr>
               <w:t>GET /accounts/{id}/{summary,findings,paths,graph}</w:t>
             </w:r>
@@ -5549,7 +5549,7 @@
             <w:r/>
             <w:r>
               <w:rPr>
-                <w:sz w:val="18"/>
+                <w:sz w:val="21"/>
               </w:rPr>
               <w:t>viewer</w:t>
             </w:r>
@@ -5565,7 +5565,7 @@
             <w:r/>
             <w:r>
               <w:rPr>
-                <w:sz w:val="18"/>
+                <w:sz w:val="21"/>
               </w:rPr>
               <w:t>POST /accounts/{id}/graph/query</w:t>
             </w:r>
@@ -5579,7 +5579,7 @@
             <w:r/>
             <w:r>
               <w:rPr>
-                <w:sz w:val="18"/>
+                <w:sz w:val="21"/>
               </w:rPr>
               <w:t>viewer</w:t>
             </w:r>
@@ -5595,7 +5595,7 @@
             <w:r/>
             <w:r>
               <w:rPr>
-                <w:sz w:val="18"/>
+                <w:sz w:val="21"/>
               </w:rPr>
               <w:t>GET /controls, GET /policies</w:t>
             </w:r>
@@ -5609,7 +5609,7 @@
             <w:r/>
             <w:r>
               <w:rPr>
-                <w:sz w:val="18"/>
+                <w:sz w:val="21"/>
               </w:rPr>
               <w:t>viewer</w:t>
             </w:r>
@@ -5625,7 +5625,7 @@
             <w:r/>
             <w:r>
               <w:rPr>
-                <w:sz w:val="18"/>
+                <w:sz w:val="21"/>
               </w:rPr>
               <w:t>POST /accounts/{id}/ingest</w:t>
             </w:r>
@@ -5639,7 +5639,7 @@
             <w:r/>
             <w:r>
               <w:rPr>
-                <w:sz w:val="18"/>
+                <w:sz w:val="21"/>
               </w:rPr>
               <w:t>ingest</w:t>
             </w:r>
@@ -5655,7 +5655,7 @@
             <w:r/>
             <w:r>
               <w:rPr>
-                <w:sz w:val="18"/>
+                <w:sz w:val="21"/>
               </w:rPr>
               <w:t>POST /accounts/{id}/edr/ingest</w:t>
             </w:r>
@@ -5669,7 +5669,7 @@
             <w:r/>
             <w:r>
               <w:rPr>
-                <w:sz w:val="18"/>
+                <w:sz w:val="21"/>
               </w:rPr>
               <w:t>ingest</w:t>
             </w:r>
@@ -5685,7 +5685,7 @@
             <w:r/>
             <w:r>
               <w:rPr>
-                <w:sz w:val="18"/>
+                <w:sz w:val="21"/>
               </w:rPr>
               <w:t>GET /registries, GET /registries/images</w:t>
             </w:r>
@@ -5699,7 +5699,7 @@
             <w:r/>
             <w:r>
               <w:rPr>
-                <w:sz w:val="18"/>
+                <w:sz w:val="21"/>
               </w:rPr>
               <w:t>viewer</w:t>
             </w:r>
@@ -5715,7 +5715,7 @@
             <w:r/>
             <w:r>
               <w:rPr>
-                <w:sz w:val="18"/>
+                <w:sz w:val="21"/>
               </w:rPr>
               <w:t>POST /registries/{id}/scan</w:t>
             </w:r>
@@ -5729,7 +5729,7 @@
             <w:r/>
             <w:r>
               <w:rPr>
-                <w:sz w:val="18"/>
+                <w:sz w:val="21"/>
               </w:rPr>
               <w:t>admin</w:t>
             </w:r>
@@ -5745,7 +5745,7 @@
             <w:r/>
             <w:r>
               <w:rPr>
-                <w:sz w:val="18"/>
+                <w:sz w:val="21"/>
               </w:rPr>
               <w:t>GET /org/{overview,findings,incidents}</w:t>
             </w:r>
@@ -5759,7 +5759,7 @@
             <w:r/>
             <w:r>
               <w:rPr>
-                <w:sz w:val="18"/>
+                <w:sz w:val="21"/>
               </w:rPr>
               <w:t>viewer</w:t>
             </w:r>
@@ -5775,7 +5775,7 @@
             <w:r/>
             <w:r>
               <w:rPr>
-                <w:sz w:val="18"/>
+                <w:sz w:val="21"/>
               </w:rPr>
               <w:t>/workspaces, /admin/*</w:t>
             </w:r>
@@ -5789,7 +5789,7 @@
             <w:r/>
             <w:r>
               <w:rPr>
-                <w:sz w:val="18"/>
+                <w:sz w:val="21"/>
               </w:rPr>
               <w:t>admin / superadmin</w:t>
             </w:r>
@@ -5836,7 +5836,7 @@
               <w:rPr>
                 <w:b/>
                 <w:color w:val="FFFFFF"/>
-                <w:sz w:val="19"/>
+                <w:sz w:val="21"/>
               </w:rPr>
               <w:t>Term</w:t>
             </w:r>
@@ -5856,7 +5856,7 @@
               <w:rPr>
                 <w:b/>
                 <w:color w:val="FFFFFF"/>
-                <w:sz w:val="19"/>
+                <w:sz w:val="21"/>
               </w:rPr>
               <w:t>Definition</w:t>
             </w:r>
@@ -5872,7 +5872,7 @@
             <w:r/>
             <w:r>
               <w:rPr>
-                <w:sz w:val="18"/>
+                <w:sz w:val="21"/>
               </w:rPr>
               <w:t>Crown jewel</w:t>
             </w:r>
@@ -5886,7 +5886,7 @@
             <w:r/>
             <w:r>
               <w:rPr>
-                <w:sz w:val="18"/>
+                <w:sz w:val="21"/>
               </w:rPr>
               <w:t>A high-value target (sensitive data store, admin capability) an attack path aims for</w:t>
             </w:r>
@@ -5902,7 +5902,7 @@
             <w:r/>
             <w:r>
               <w:rPr>
-                <w:sz w:val="18"/>
+                <w:sz w:val="21"/>
               </w:rPr>
               <w:t>Attack path</w:t>
             </w:r>
@@ -5916,7 +5916,7 @@
             <w:r/>
             <w:r>
               <w:rPr>
-                <w:sz w:val="18"/>
+                <w:sz w:val="21"/>
               </w:rPr>
               <w:t>An entry→target chain over traversable edges; the unit of risk ranking</w:t>
             </w:r>
@@ -5932,7 +5932,7 @@
             <w:r/>
             <w:r>
               <w:rPr>
-                <w:sz w:val="18"/>
+                <w:sz w:val="21"/>
               </w:rPr>
               <w:t>Choke point</w:t>
             </w:r>
@@ -5946,7 +5946,7 @@
             <w:r/>
             <w:r>
               <w:rPr>
-                <w:sz w:val="18"/>
+                <w:sz w:val="21"/>
               </w:rPr>
               <w:t>A node whose remediation severs many paths to many crown jewels</w:t>
             </w:r>
@@ -5962,7 +5962,7 @@
             <w:r/>
             <w:r>
               <w:rPr>
-                <w:sz w:val="18"/>
+                <w:sz w:val="21"/>
               </w:rPr>
               <w:t>E_PATH</w:t>
             </w:r>
@@ -5976,7 +5976,7 @@
             <w:r/>
             <w:r>
               <w:rPr>
-                <w:sz w:val="18"/>
+                <w:sz w:val="21"/>
               </w:rPr>
               <w:t>The frozen set of edge kinds that are walked when computing attack paths</w:t>
             </w:r>
@@ -5992,7 +5992,7 @@
             <w:r/>
             <w:r>
               <w:rPr>
-                <w:sz w:val="18"/>
+                <w:sz w:val="21"/>
               </w:rPr>
               <w:t>Deep plane</w:t>
             </w:r>
@@ -6006,7 +6006,7 @@
             <w:r/>
             <w:r>
               <w:rPr>
-                <w:sz w:val="18"/>
+                <w:sz w:val="21"/>
               </w:rPr>
               <w:t>AWS-native detectors (Inspector/Macie/GuardDuty/Access Analyzer) ingested as signal</w:t>
             </w:r>
@@ -6022,7 +6022,7 @@
             <w:r/>
             <w:r>
               <w:rPr>
-                <w:sz w:val="18"/>
+                <w:sz w:val="21"/>
               </w:rPr>
               <w:t>Display-only overlay</w:t>
             </w:r>
@@ -6036,7 +6036,7 @@
             <w:r/>
             <w:r>
               <w:rPr>
-                <w:sz w:val="18"/>
+                <w:sz w:val="21"/>
               </w:rPr>
               <w:t>A read-time WARN finding that never affects posture or the graph</w:t>
             </w:r>
@@ -6052,7 +6052,7 @@
             <w:r/>
             <w:r>
               <w:rPr>
-                <w:sz w:val="18"/>
+                <w:sz w:val="21"/>
               </w:rPr>
               <w:t>Hub / spoke</w:t>
             </w:r>
@@ -6066,7 +6066,7 @@
             <w:r/>
             <w:r>
               <w:rPr>
-                <w:sz w:val="18"/>
+                <w:sz w:val="21"/>
               </w:rPr>
               <w:t>The self-hosted OverWatch instance / an audited AWS account</w:t>
             </w:r>
@@ -6082,7 +6082,7 @@
             <w:r/>
             <w:r>
               <w:rPr>
-                <w:sz w:val="18"/>
+                <w:sz w:val="21"/>
               </w:rPr>
               <w:t>CWPP / DSPM / CIEM / AI-SPM</w:t>
             </w:r>
@@ -6096,7 +6096,7 @@
             <w:r/>
             <w:r>
               <w:rPr>
-                <w:sz w:val="18"/>
+                <w:sz w:val="21"/>
               </w:rPr>
               <w:t>Workload / data / entitlement / AI security posture pillars</w:t>
             </w:r>
@@ -6516,7 +6516,7 @@
     <w:rPr>
       <w:rFonts w:ascii="Calibri" w:hAnsi="Calibri"/>
       <w:color w:val="1F2A37"/>
-      <w:sz w:val="21"/>
+      <w:sz w:val="24"/>
     </w:rPr>
   </w:style>
   <w:style w:type="paragraph" w:styleId="Header">
@@ -6582,7 +6582,7 @@
       <w:b/>
       <w:bCs/>
       <w:color w:val="143355"/>
-      <w:sz w:val="32"/>
+      <w:sz w:val="36"/>
       <w:szCs w:val="28"/>
     </w:rPr>
   </w:style>
@@ -6606,7 +6606,7 @@
       <w:b/>
       <w:bCs/>
       <w:color w:val="143355"/>
-      <w:sz w:val="26"/>
+      <w:sz w:val="29"/>
       <w:szCs w:val="26"/>
     </w:rPr>
   </w:style>
@@ -6630,7 +6630,7 @@
       <w:b/>
       <w:bCs/>
       <w:color w:val="143355"/>
-      <w:sz w:val="23"/>
+      <w:sz w:val="26"/>
     </w:rPr>
   </w:style>
   <w:style w:type="paragraph" w:styleId="Heading4">

</xml_diff>